<commit_message>
JEREZ: turnos de trabajo en todos los contratos (cláusula jornada)
Agrega la tabla completa de turnos (7 a 10 horas aprox., AM/PM/noche, 95
turnos) a la cláusula SEGUNDO de los contratos de JEREZ, con el texto de
cierre referencial (pactados con 1 semana de anticipación, ajustables,
horarios en el Reglamento Interno). Fuente única: scripts/gen_plantillas_jerez.py
(reusar para nuevos cargos/variantes de JEREZ). Regenera ambas plantillas
de Ayudante de Cocina PT (chileno y extranjero).

Co-Authored-By: Claude Opus 4.8 <noreply@anthropic.com>
</commit_message>
<xml_diff>
--- a/app/plantillas/JEREZ 78269062-0/CONTRATO Ayudante Cocina PT - Plazo Fijo.docx
+++ b/app/plantillas/JEREZ 78269062-0/CONTRATO Ayudante Cocina PT - Plazo Fijo.docx
@@ -68,6 +68,9 @@
         <w:jc w:val="both"/>
       </w:pPr>
       <w:r>
+        <w:rPr>
+          <w:b w:val="0"/>
+        </w:rPr>
         <w:t>- Producción y Mise en Place: realizar la preparación previa de ingredientes (cortar, picar, marinar) y producción según recetario oficial.</w:t>
       </w:r>
     </w:p>
@@ -77,6 +80,9 @@
         <w:jc w:val="both"/>
       </w:pPr>
       <w:r>
+        <w:rPr>
+          <w:b w:val="0"/>
+        </w:rPr>
         <w:t>- Operación de Cuartos: ejercer labores de cocina tanto en cuarto frío como en cuarto caliente, asegurando la correcta cocción y montaje.</w:t>
       </w:r>
     </w:p>
@@ -86,6 +92,9 @@
         <w:jc w:val="both"/>
       </w:pPr>
       <w:r>
+        <w:rPr>
+          <w:b w:val="0"/>
+        </w:rPr>
         <w:t>- Logística Operativa: ejercer labores de "tercero" o runner, recibiendo comandas y entregando el producto terminado al área de caja/reparto.</w:t>
       </w:r>
     </w:p>
@@ -95,6 +104,9 @@
         <w:jc w:val="both"/>
       </w:pPr>
       <w:r>
+        <w:rPr>
+          <w:b w:val="0"/>
+        </w:rPr>
         <w:t>- Orden e Higiene: mantener la limpieza profunda de la cocina, utensilios y equipos. Almacenar alimentos en bodega siguiendo estrictamente las prácticas sanitarias (FIFO) y de seguridad.</w:t>
       </w:r>
     </w:p>
@@ -104,6 +116,9 @@
         <w:jc w:val="both"/>
       </w:pPr>
       <w:r>
+        <w:rPr>
+          <w:b w:val="0"/>
+        </w:rPr>
         <w:t>- Apoyo al Equipo: colaborar en la inducción de nuevos ingresos y asumir la encargatura de turno si es solicitado por la jefatura.</w:t>
       </w:r>
     </w:p>
@@ -133,7 +148,1407 @@
         <w:t xml:space="preserve">SEGUNDO: JORNADA DE TRABAJO. </w:t>
       </w:r>
       <w:r>
-        <w:t>La jornada de trabajo será de 30 horas semanales, distribuida de lunes a domingo conforme al sistema de turnos rotativos y variables que el Empleador publicará semanalmente, con un día de descanso a la semana (y al menos dos domingos libres al mes). El Trabajador contará con una colación de 30 minutos diarios (no imputables a la jornada). De lo anterior, se seguirá lo informado en el respectivo Reglamento Interno de Orden, Higiene y Seguridad. Con todo, y sin perjuicio de las modificaciones que conforme a las necesidades del servicio se dispongan, y siempre en coordinación con el equipo de trabajo, se dispondrán las horas de trabajo dentro del rango de 11:00 a 00:30 horas.</w:t>
+        <w:t>La jornada de trabajo será de 30 horas semanales, distribuida de lunes a domingo conforme al sistema de turnos rotativos y variables que el Empleador publicará semanalmente, con un día de descanso a la semana (y al menos dos domingos libres al mes). El Trabajador contará con una colación de 30 minutos diarios (no imputables a la jornada). De lo anterior, se seguirá lo informado en el respectivo Reglamento Interno de Orden, Higiene y Seguridad. Los turnos de trabajo, de carácter referencial, se distribuirán conforme a la siguiente tabla:</w:t>
+      </w:r>
+    </w:p>
+    <w:p>
+      <w:pPr>
+        <w:ind w:left="360"/>
+        <w:jc w:val="both"/>
+      </w:pPr>
+      <w:r>
+        <w:rPr>
+          <w:b/>
+        </w:rPr>
+        <w:t>JORNADA DE 7 HORAS APROXIMADAS</w:t>
+      </w:r>
+    </w:p>
+    <w:p>
+      <w:pPr>
+        <w:ind w:left="360"/>
+        <w:jc w:val="both"/>
+      </w:pPr>
+      <w:r>
+        <w:rPr>
+          <w:b/>
+        </w:rPr>
+        <w:t>TURNOS AM</w:t>
+      </w:r>
+    </w:p>
+    <w:p>
+      <w:pPr>
+        <w:ind w:left="360"/>
+        <w:jc w:val="both"/>
+      </w:pPr>
+      <w:r>
+        <w:rPr>
+          <w:b w:val="0"/>
+        </w:rPr>
+        <w:t>Turno A1: Lunes a viernes 09:00 – 16:00, sábado 09:00 – 16:00. Domingo libre.</w:t>
+      </w:r>
+    </w:p>
+    <w:p>
+      <w:pPr>
+        <w:ind w:left="360"/>
+        <w:jc w:val="both"/>
+      </w:pPr>
+      <w:r>
+        <w:rPr>
+          <w:b w:val="0"/>
+        </w:rPr>
+        <w:t>Turno A2: Lunes a viernes 09:30 – 16:30, sábado 09:30 – 16:30. Domingo libre.</w:t>
+      </w:r>
+    </w:p>
+    <w:p>
+      <w:pPr>
+        <w:ind w:left="360"/>
+        <w:jc w:val="both"/>
+      </w:pPr>
+      <w:r>
+        <w:rPr>
+          <w:b w:val="0"/>
+        </w:rPr>
+        <w:t>Turno A3: Lunes a viernes 10:00 – 17:00, sábado 10:00 – 17:00. Domingo libre.</w:t>
+      </w:r>
+    </w:p>
+    <w:p>
+      <w:pPr>
+        <w:ind w:left="360"/>
+        <w:jc w:val="both"/>
+      </w:pPr>
+      <w:r>
+        <w:rPr>
+          <w:b w:val="0"/>
+        </w:rPr>
+        <w:t>Turno A4: Lunes a viernes 10:30 – 17:30, sábado 10:30 – 17:30. Domingo libre.</w:t>
+      </w:r>
+    </w:p>
+    <w:p>
+      <w:pPr>
+        <w:ind w:left="360"/>
+        <w:jc w:val="both"/>
+      </w:pPr>
+      <w:r>
+        <w:rPr>
+          <w:b w:val="0"/>
+        </w:rPr>
+        <w:t>Turno A5: Lunes a viernes 11:00 – 18:00, sábado 11:00 – 18:00. Domingo libre.</w:t>
+      </w:r>
+    </w:p>
+    <w:p>
+      <w:pPr>
+        <w:ind w:left="360"/>
+        <w:jc w:val="both"/>
+      </w:pPr>
+      <w:r>
+        <w:rPr>
+          <w:b w:val="0"/>
+        </w:rPr>
+        <w:t>Turno A6: Lunes a viernes 11:30 – 18:30, sábado 11:30 – 18:30. Domingo libre.</w:t>
+      </w:r>
+    </w:p>
+    <w:p>
+      <w:pPr>
+        <w:ind w:left="360"/>
+        <w:jc w:val="both"/>
+      </w:pPr>
+      <w:r>
+        <w:rPr>
+          <w:b w:val="0"/>
+        </w:rPr>
+        <w:t>Turno A7: Lunes a viernes 12:00 – 19:00, sábado 12:00 – 19:00. Domingo libre.</w:t>
+      </w:r>
+    </w:p>
+    <w:p>
+      <w:pPr>
+        <w:ind w:left="360"/>
+        <w:jc w:val="both"/>
+      </w:pPr>
+      <w:r>
+        <w:rPr>
+          <w:b/>
+        </w:rPr>
+        <w:t>TURNOS PM</w:t>
+      </w:r>
+    </w:p>
+    <w:p>
+      <w:pPr>
+        <w:ind w:left="360"/>
+        <w:jc w:val="both"/>
+      </w:pPr>
+      <w:r>
+        <w:rPr>
+          <w:b w:val="0"/>
+        </w:rPr>
+        <w:t>Turno P1: Lunes a viernes 15:00 – 22:00, sábado 15:00 – 22:00. Domingo libre.</w:t>
+      </w:r>
+    </w:p>
+    <w:p>
+      <w:pPr>
+        <w:ind w:left="360"/>
+        <w:jc w:val="both"/>
+      </w:pPr>
+      <w:r>
+        <w:rPr>
+          <w:b w:val="0"/>
+        </w:rPr>
+        <w:t>Turno P2: Lunes a viernes 15:30 – 22:30, sábado 15:30 – 22:30. Domingo libre.</w:t>
+      </w:r>
+    </w:p>
+    <w:p>
+      <w:pPr>
+        <w:ind w:left="360"/>
+        <w:jc w:val="both"/>
+      </w:pPr>
+      <w:r>
+        <w:rPr>
+          <w:b w:val="0"/>
+        </w:rPr>
+        <w:t>Turno P3: Lunes a viernes 16:00 – 23:00, sábado 16:00 – 23:00. Domingo libre.</w:t>
+      </w:r>
+    </w:p>
+    <w:p>
+      <w:pPr>
+        <w:ind w:left="360"/>
+        <w:jc w:val="both"/>
+      </w:pPr>
+      <w:r>
+        <w:rPr>
+          <w:b w:val="0"/>
+        </w:rPr>
+        <w:t>Turno P4: Lunes a viernes 16:30 – 23:30, sábado 16:30 – 23:30. Domingo libre.</w:t>
+      </w:r>
+    </w:p>
+    <w:p>
+      <w:pPr>
+        <w:ind w:left="360"/>
+        <w:jc w:val="both"/>
+      </w:pPr>
+      <w:r>
+        <w:rPr>
+          <w:b w:val="0"/>
+        </w:rPr>
+        <w:t>Turno P5: Lunes a viernes 13:00 – 20:00, sábado 13:00 – 20:00. Domingo libre.</w:t>
+      </w:r>
+    </w:p>
+    <w:p>
+      <w:pPr>
+        <w:ind w:left="360"/>
+        <w:jc w:val="both"/>
+      </w:pPr>
+      <w:r>
+        <w:rPr>
+          <w:b w:val="0"/>
+        </w:rPr>
+        <w:t>Turno P6: Lunes a viernes 13:30 – 20:30, sábado 13:30 – 20:30. Domingo libre.</w:t>
+      </w:r>
+    </w:p>
+    <w:p>
+      <w:pPr>
+        <w:ind w:left="360"/>
+        <w:jc w:val="both"/>
+      </w:pPr>
+      <w:r>
+        <w:rPr>
+          <w:b w:val="0"/>
+        </w:rPr>
+        <w:t>Turno P7: Lunes a viernes 14:00 – 21:00, sábado 14:00 – 21:00. Domingo libre.</w:t>
+      </w:r>
+    </w:p>
+    <w:p>
+      <w:pPr>
+        <w:ind w:left="360"/>
+        <w:jc w:val="both"/>
+      </w:pPr>
+      <w:r>
+        <w:rPr>
+          <w:b w:val="0"/>
+        </w:rPr>
+        <w:t>Turno N1: Lunes a viernes 17:00 – 00:00, sábado 17:00 – 00:00. Domingo libre.</w:t>
+      </w:r>
+    </w:p>
+    <w:p>
+      <w:pPr>
+        <w:ind w:left="360"/>
+        <w:jc w:val="both"/>
+      </w:pPr>
+      <w:r>
+        <w:rPr>
+          <w:b w:val="0"/>
+        </w:rPr>
+        <w:t>Turno N2: Lunes a viernes 17:30 – 00:30, sábado 17:30 – 00:30. Domingo libre.</w:t>
+      </w:r>
+    </w:p>
+    <w:p>
+      <w:pPr>
+        <w:ind w:left="360"/>
+        <w:jc w:val="both"/>
+      </w:pPr>
+      <w:r>
+        <w:rPr>
+          <w:b w:val="0"/>
+        </w:rPr>
+        <w:t>Turno N3: Lunes a viernes 18:00 – 01:00, sábado 18:00 – 01:00. Domingo libre.</w:t>
+      </w:r>
+    </w:p>
+    <w:p>
+      <w:pPr>
+        <w:ind w:left="360"/>
+        <w:jc w:val="both"/>
+      </w:pPr>
+      <w:r>
+        <w:rPr>
+          <w:b/>
+        </w:rPr>
+        <w:t>JORNADA DE 7,5 HORAS APROXIMADAS</w:t>
+      </w:r>
+    </w:p>
+    <w:p>
+      <w:pPr>
+        <w:ind w:left="360"/>
+        <w:jc w:val="both"/>
+      </w:pPr>
+      <w:r>
+        <w:rPr>
+          <w:b/>
+        </w:rPr>
+        <w:t>TURNOS AM</w:t>
+      </w:r>
+    </w:p>
+    <w:p>
+      <w:pPr>
+        <w:ind w:left="360"/>
+        <w:jc w:val="both"/>
+      </w:pPr>
+      <w:r>
+        <w:rPr>
+          <w:b w:val="0"/>
+        </w:rPr>
+        <w:t>Turno A1: Lunes a viernes 09:00 – 16:15, sábado 09:00 – 15:45. Domingo libre.</w:t>
+      </w:r>
+    </w:p>
+    <w:p>
+      <w:pPr>
+        <w:ind w:left="360"/>
+        <w:jc w:val="both"/>
+      </w:pPr>
+      <w:r>
+        <w:rPr>
+          <w:b w:val="0"/>
+        </w:rPr>
+        <w:t>Turno A2: Lunes a viernes 09:30 – 16:45, sábado 09:30 – 16:15. Domingo libre.</w:t>
+      </w:r>
+    </w:p>
+    <w:p>
+      <w:pPr>
+        <w:ind w:left="360"/>
+        <w:jc w:val="both"/>
+      </w:pPr>
+      <w:r>
+        <w:rPr>
+          <w:b w:val="0"/>
+        </w:rPr>
+        <w:t>Turno A3: Lunes a viernes 10:00 – 17:15, sábado 10:00 – 16:45. Domingo libre.</w:t>
+      </w:r>
+    </w:p>
+    <w:p>
+      <w:pPr>
+        <w:ind w:left="360"/>
+        <w:jc w:val="both"/>
+      </w:pPr>
+      <w:r>
+        <w:rPr>
+          <w:b w:val="0"/>
+        </w:rPr>
+        <w:t>Turno A4: Lunes a viernes 10:30 – 17:45, sábado 10:30 – 17:15. Domingo libre.</w:t>
+      </w:r>
+    </w:p>
+    <w:p>
+      <w:pPr>
+        <w:ind w:left="360"/>
+        <w:jc w:val="both"/>
+      </w:pPr>
+      <w:r>
+        <w:rPr>
+          <w:b w:val="0"/>
+        </w:rPr>
+        <w:t>Turno A5: Lunes a viernes 11:00 – 18:15, sábado 11:00 – 17:45. Domingo libre.</w:t>
+      </w:r>
+    </w:p>
+    <w:p>
+      <w:pPr>
+        <w:ind w:left="360"/>
+        <w:jc w:val="both"/>
+      </w:pPr>
+      <w:r>
+        <w:rPr>
+          <w:b w:val="0"/>
+        </w:rPr>
+        <w:t>Turno A6: Lunes a viernes 11:30 – 18:45, sábado 11:30 – 18:15. Domingo libre.</w:t>
+      </w:r>
+    </w:p>
+    <w:p>
+      <w:pPr>
+        <w:ind w:left="360"/>
+        <w:jc w:val="both"/>
+      </w:pPr>
+      <w:r>
+        <w:rPr>
+          <w:b w:val="0"/>
+        </w:rPr>
+        <w:t>Turno A7: Lunes a viernes 12:00 – 19:15, sábado 12:00 – 18:45. Domingo libre.</w:t>
+      </w:r>
+    </w:p>
+    <w:p>
+      <w:pPr>
+        <w:ind w:left="360"/>
+        <w:jc w:val="both"/>
+      </w:pPr>
+      <w:r>
+        <w:rPr>
+          <w:b/>
+        </w:rPr>
+        <w:t>TURNOS PM</w:t>
+      </w:r>
+    </w:p>
+    <w:p>
+      <w:pPr>
+        <w:ind w:left="360"/>
+        <w:jc w:val="both"/>
+      </w:pPr>
+      <w:r>
+        <w:rPr>
+          <w:b w:val="0"/>
+        </w:rPr>
+        <w:t>Turno P1: Lunes a viernes 15:00 – 22:15, sábado 15:00 – 21:45. Domingo libre.</w:t>
+      </w:r>
+    </w:p>
+    <w:p>
+      <w:pPr>
+        <w:ind w:left="360"/>
+        <w:jc w:val="both"/>
+      </w:pPr>
+      <w:r>
+        <w:rPr>
+          <w:b w:val="0"/>
+        </w:rPr>
+        <w:t>Turno P2: Lunes a viernes 15:30 – 22:45, sábado 15:30 – 22:15. Domingo libre.</w:t>
+      </w:r>
+    </w:p>
+    <w:p>
+      <w:pPr>
+        <w:ind w:left="360"/>
+        <w:jc w:val="both"/>
+      </w:pPr>
+      <w:r>
+        <w:rPr>
+          <w:b w:val="0"/>
+        </w:rPr>
+        <w:t>Turno P3: Lunes a viernes 16:00 – 23:15, sábado 16:00 – 22:45. Domingo libre.</w:t>
+      </w:r>
+    </w:p>
+    <w:p>
+      <w:pPr>
+        <w:ind w:left="360"/>
+        <w:jc w:val="both"/>
+      </w:pPr>
+      <w:r>
+        <w:rPr>
+          <w:b w:val="0"/>
+        </w:rPr>
+        <w:t>Turno P4: Lunes a viernes 16:30 – 23:45, sábado 16:30 – 23:15. Domingo libre.</w:t>
+      </w:r>
+    </w:p>
+    <w:p>
+      <w:pPr>
+        <w:ind w:left="360"/>
+        <w:jc w:val="both"/>
+      </w:pPr>
+      <w:r>
+        <w:rPr>
+          <w:b w:val="0"/>
+        </w:rPr>
+        <w:t>Turno N1: Lunes a viernes 17:00 – 00:15, sábado 17:00 – 23:45. Domingo libre.</w:t>
+      </w:r>
+    </w:p>
+    <w:p>
+      <w:pPr>
+        <w:ind w:left="360"/>
+        <w:jc w:val="both"/>
+      </w:pPr>
+      <w:r>
+        <w:rPr>
+          <w:b w:val="0"/>
+        </w:rPr>
+        <w:t>Turno N2: Lunes a viernes 17:15 – 00:30, sábado 17:15 – 23:30. Domingo libre.</w:t>
+      </w:r>
+    </w:p>
+    <w:p>
+      <w:pPr>
+        <w:ind w:left="360"/>
+        <w:jc w:val="both"/>
+      </w:pPr>
+      <w:r>
+        <w:rPr>
+          <w:b w:val="0"/>
+        </w:rPr>
+        <w:t>Turno N3: Lunes a viernes 17:00 – 00:30, sábado 18:00 – 23:30. Domingo libre.</w:t>
+      </w:r>
+    </w:p>
+    <w:p>
+      <w:pPr>
+        <w:ind w:left="360"/>
+        <w:jc w:val="both"/>
+      </w:pPr>
+      <w:r>
+        <w:rPr>
+          <w:b w:val="0"/>
+        </w:rPr>
+        <w:t>Turno N4: Lunes a viernes 17:15 – 00:30, sábado 17:45 – 23:45. Domingo libre.</w:t>
+      </w:r>
+    </w:p>
+    <w:p>
+      <w:pPr>
+        <w:ind w:left="360"/>
+        <w:jc w:val="both"/>
+      </w:pPr>
+      <w:r>
+        <w:rPr>
+          <w:b/>
+        </w:rPr>
+        <w:t>JORNADA DE 8 HORAS APROXIMADAS</w:t>
+      </w:r>
+    </w:p>
+    <w:p>
+      <w:pPr>
+        <w:ind w:left="360"/>
+        <w:jc w:val="both"/>
+      </w:pPr>
+      <w:r>
+        <w:rPr>
+          <w:b/>
+        </w:rPr>
+        <w:t>TURNOS AM</w:t>
+      </w:r>
+    </w:p>
+    <w:p>
+      <w:pPr>
+        <w:ind w:left="360"/>
+        <w:jc w:val="both"/>
+      </w:pPr>
+      <w:r>
+        <w:rPr>
+          <w:b w:val="0"/>
+        </w:rPr>
+        <w:t>Turno B1: Lunes a viernes 09:00 – 16:10, sábado 09:00 – 16:10. Domingo libre.</w:t>
+      </w:r>
+    </w:p>
+    <w:p>
+      <w:pPr>
+        <w:ind w:left="360"/>
+        <w:jc w:val="both"/>
+      </w:pPr>
+      <w:r>
+        <w:rPr>
+          <w:b w:val="0"/>
+        </w:rPr>
+        <w:t>Turno B2: Lunes a viernes 09:30 – 16:40, sábado 09:30 – 16:40. Domingo libre.</w:t>
+      </w:r>
+    </w:p>
+    <w:p>
+      <w:pPr>
+        <w:ind w:left="360"/>
+        <w:jc w:val="both"/>
+      </w:pPr>
+      <w:r>
+        <w:rPr>
+          <w:b w:val="0"/>
+        </w:rPr>
+        <w:t>Turno B3: Lunes a viernes 10:00 – 17:10, sábado 10:00 – 17:10. Domingo libre.</w:t>
+      </w:r>
+    </w:p>
+    <w:p>
+      <w:pPr>
+        <w:ind w:left="360"/>
+        <w:jc w:val="both"/>
+      </w:pPr>
+      <w:r>
+        <w:rPr>
+          <w:b w:val="0"/>
+        </w:rPr>
+        <w:t>Turno B4: Lunes a viernes 10:30 – 17:40, sábado 10:30 – 17:40. Domingo libre.</w:t>
+      </w:r>
+    </w:p>
+    <w:p>
+      <w:pPr>
+        <w:ind w:left="360"/>
+        <w:jc w:val="both"/>
+      </w:pPr>
+      <w:r>
+        <w:rPr>
+          <w:b w:val="0"/>
+        </w:rPr>
+        <w:t>Turno B5: Lunes a viernes 11:00 – 18:10, sábado 11:00 – 18:10. Domingo libre.</w:t>
+      </w:r>
+    </w:p>
+    <w:p>
+      <w:pPr>
+        <w:ind w:left="360"/>
+        <w:jc w:val="both"/>
+      </w:pPr>
+      <w:r>
+        <w:rPr>
+          <w:b w:val="0"/>
+        </w:rPr>
+        <w:t>Turno B6: Lunes a viernes 11:30 – 18:40, sábado 11:30 – 18:40. Domingo libre.</w:t>
+      </w:r>
+    </w:p>
+    <w:p>
+      <w:pPr>
+        <w:ind w:left="360"/>
+        <w:jc w:val="both"/>
+      </w:pPr>
+      <w:r>
+        <w:rPr>
+          <w:b w:val="0"/>
+        </w:rPr>
+        <w:t>Turno B7: Lunes a viernes 12:00 – 19:10, sábado 12:00 – 19:10. Domingo libre.</w:t>
+      </w:r>
+    </w:p>
+    <w:p>
+      <w:pPr>
+        <w:ind w:left="360"/>
+        <w:jc w:val="both"/>
+      </w:pPr>
+      <w:r>
+        <w:rPr>
+          <w:b/>
+        </w:rPr>
+        <w:t>TURNOS PM</w:t>
+      </w:r>
+    </w:p>
+    <w:p>
+      <w:pPr>
+        <w:ind w:left="360"/>
+        <w:jc w:val="both"/>
+      </w:pPr>
+      <w:r>
+        <w:rPr>
+          <w:b w:val="0"/>
+        </w:rPr>
+        <w:t>Turno P1: Lunes a viernes 15:00 – 22:15, sábado 15:00 – 21:45. Domingo libre.</w:t>
+      </w:r>
+    </w:p>
+    <w:p>
+      <w:pPr>
+        <w:ind w:left="360"/>
+        <w:jc w:val="both"/>
+      </w:pPr>
+      <w:r>
+        <w:rPr>
+          <w:b w:val="0"/>
+        </w:rPr>
+        <w:t>Turno P2: Lunes a viernes 15:30 – 22:45, sábado 15:30 – 22:15. Domingo libre.</w:t>
+      </w:r>
+    </w:p>
+    <w:p>
+      <w:pPr>
+        <w:ind w:left="360"/>
+        <w:jc w:val="both"/>
+      </w:pPr>
+      <w:r>
+        <w:rPr>
+          <w:b w:val="0"/>
+        </w:rPr>
+        <w:t>Turno P3: Lunes a viernes 16:00 – 23:15, sábado 16:00 – 22:45. Domingo libre.</w:t>
+      </w:r>
+    </w:p>
+    <w:p>
+      <w:pPr>
+        <w:ind w:left="360"/>
+        <w:jc w:val="both"/>
+      </w:pPr>
+      <w:r>
+        <w:rPr>
+          <w:b w:val="0"/>
+        </w:rPr>
+        <w:t>Turno P4: Lunes a viernes 16:30 – 23:45, sábado 16:30 – 23:15. Domingo libre.</w:t>
+      </w:r>
+    </w:p>
+    <w:p>
+      <w:pPr>
+        <w:ind w:left="360"/>
+        <w:jc w:val="both"/>
+      </w:pPr>
+      <w:r>
+        <w:rPr>
+          <w:b w:val="0"/>
+        </w:rPr>
+        <w:t>Turno N1: Lunes a viernes 17:00 – 00:15, sábado 17:00 – 23:45. Domingo libre.</w:t>
+      </w:r>
+    </w:p>
+    <w:p>
+      <w:pPr>
+        <w:ind w:left="360"/>
+        <w:jc w:val="both"/>
+      </w:pPr>
+      <w:r>
+        <w:rPr>
+          <w:b w:val="0"/>
+        </w:rPr>
+        <w:t>Turno N2: Lunes a viernes 17:15 – 00:30, sábado 17:15 – 23:30. Domingo libre.</w:t>
+      </w:r>
+    </w:p>
+    <w:p>
+      <w:pPr>
+        <w:ind w:left="360"/>
+        <w:jc w:val="both"/>
+      </w:pPr>
+      <w:r>
+        <w:rPr>
+          <w:b w:val="0"/>
+        </w:rPr>
+        <w:t>Turno N3: Lunes a viernes 17:00 – 00:30, sábado 18:00 – 23:30. Domingo libre.</w:t>
+      </w:r>
+    </w:p>
+    <w:p>
+      <w:pPr>
+        <w:ind w:left="360"/>
+        <w:jc w:val="both"/>
+      </w:pPr>
+      <w:r>
+        <w:rPr>
+          <w:b/>
+        </w:rPr>
+        <w:t>JORNADA DE 8,5 HORAS APROXIMADAS</w:t>
+      </w:r>
+    </w:p>
+    <w:p>
+      <w:pPr>
+        <w:ind w:left="360"/>
+        <w:jc w:val="both"/>
+      </w:pPr>
+      <w:r>
+        <w:rPr>
+          <w:b/>
+        </w:rPr>
+        <w:t>TURNOS AM</w:t>
+      </w:r>
+    </w:p>
+    <w:p>
+      <w:pPr>
+        <w:ind w:left="360"/>
+        <w:jc w:val="both"/>
+      </w:pPr>
+      <w:r>
+        <w:rPr>
+          <w:b w:val="0"/>
+        </w:rPr>
+        <w:t>Turno C1: Lunes a jueves 09:00 – 17:30, viernes 09:00 – 17:30. Sábado y domingo libres.</w:t>
+      </w:r>
+    </w:p>
+    <w:p>
+      <w:pPr>
+        <w:ind w:left="360"/>
+        <w:jc w:val="both"/>
+      </w:pPr>
+      <w:r>
+        <w:rPr>
+          <w:b w:val="0"/>
+        </w:rPr>
+        <w:t>Turno C2: Lunes a jueves 09:30 – 18:00, viernes 09:30 – 18:00. Sábado y domingo libres.</w:t>
+      </w:r>
+    </w:p>
+    <w:p>
+      <w:pPr>
+        <w:ind w:left="360"/>
+        <w:jc w:val="both"/>
+      </w:pPr>
+      <w:r>
+        <w:rPr>
+          <w:b w:val="0"/>
+        </w:rPr>
+        <w:t>Turno C3: Lunes a jueves 10:00 – 18:30, viernes 10:00 – 18:30. Sábado y domingo libres.</w:t>
+      </w:r>
+    </w:p>
+    <w:p>
+      <w:pPr>
+        <w:ind w:left="360"/>
+        <w:jc w:val="both"/>
+      </w:pPr>
+      <w:r>
+        <w:rPr>
+          <w:b w:val="0"/>
+        </w:rPr>
+        <w:t>Turno C4: Lunes a jueves 10:30 – 19:00, viernes 10:30 – 19:00. Sábado y domingo libres.</w:t>
+      </w:r>
+    </w:p>
+    <w:p>
+      <w:pPr>
+        <w:ind w:left="360"/>
+        <w:jc w:val="both"/>
+      </w:pPr>
+      <w:r>
+        <w:rPr>
+          <w:b w:val="0"/>
+        </w:rPr>
+        <w:t>Turno C5: Lunes a jueves 11:00 – 19:30, viernes 11:00 – 19:30. Sábado y domingo libres.</w:t>
+      </w:r>
+    </w:p>
+    <w:p>
+      <w:pPr>
+        <w:ind w:left="360"/>
+        <w:jc w:val="both"/>
+      </w:pPr>
+      <w:r>
+        <w:rPr>
+          <w:b w:val="0"/>
+        </w:rPr>
+        <w:t>Turno C6: Lunes a jueves 11:30 – 20:00, viernes 11:30 – 20:00. Sábado y domingo libres.</w:t>
+      </w:r>
+    </w:p>
+    <w:p>
+      <w:pPr>
+        <w:ind w:left="360"/>
+        <w:jc w:val="both"/>
+      </w:pPr>
+      <w:r>
+        <w:rPr>
+          <w:b/>
+        </w:rPr>
+        <w:t>TURNOS PM</w:t>
+      </w:r>
+    </w:p>
+    <w:p>
+      <w:pPr>
+        <w:ind w:left="360"/>
+        <w:jc w:val="both"/>
+      </w:pPr>
+      <w:r>
+        <w:rPr>
+          <w:b w:val="0"/>
+        </w:rPr>
+        <w:t>Turno P1: Lunes a jueves 15:00 – 22:15, viernes 15:00 – 22:15. Sábado y domingo libres.</w:t>
+      </w:r>
+    </w:p>
+    <w:p>
+      <w:pPr>
+        <w:ind w:left="360"/>
+        <w:jc w:val="both"/>
+      </w:pPr>
+      <w:r>
+        <w:rPr>
+          <w:b w:val="0"/>
+        </w:rPr>
+        <w:t>Turno P2: Lunes a jueves 15:30 – 22:45, viernes 15:30 – 22:45. Sábado y domingo libres.</w:t>
+      </w:r>
+    </w:p>
+    <w:p>
+      <w:pPr>
+        <w:ind w:left="360"/>
+        <w:jc w:val="both"/>
+      </w:pPr>
+      <w:r>
+        <w:rPr>
+          <w:b w:val="0"/>
+        </w:rPr>
+        <w:t>Turno P3: Lunes a jueves 16:00 – 23:15, viernes 16:00 – 23:15. Sábado y domingo libres.</w:t>
+      </w:r>
+    </w:p>
+    <w:p>
+      <w:pPr>
+        <w:ind w:left="360"/>
+        <w:jc w:val="both"/>
+      </w:pPr>
+      <w:r>
+        <w:rPr>
+          <w:b w:val="0"/>
+        </w:rPr>
+        <w:t>Turno P4: Lunes a jueves 16:30 – 23:45, viernes 16:30 – 23:45. Sábado y domingo libres.</w:t>
+      </w:r>
+    </w:p>
+    <w:p>
+      <w:pPr>
+        <w:ind w:left="360"/>
+        <w:jc w:val="both"/>
+      </w:pPr>
+      <w:r>
+        <w:rPr>
+          <w:b w:val="0"/>
+        </w:rPr>
+        <w:t>Turno N1: Lunes a jueves 17:00 – 00:15, viernes 17:00 – 00:15. Sábado y domingo libres.</w:t>
+      </w:r>
+    </w:p>
+    <w:p>
+      <w:pPr>
+        <w:ind w:left="360"/>
+        <w:jc w:val="both"/>
+      </w:pPr>
+      <w:r>
+        <w:rPr>
+          <w:b w:val="0"/>
+        </w:rPr>
+        <w:t>Turno N2: Lunes a jueves 17:30 – 00:30, viernes 17:30 – 00:30. Sábado y domingo libres.</w:t>
+      </w:r>
+    </w:p>
+    <w:p>
+      <w:pPr>
+        <w:ind w:left="360"/>
+        <w:jc w:val="both"/>
+      </w:pPr>
+      <w:r>
+        <w:rPr>
+          <w:b w:val="0"/>
+        </w:rPr>
+        <w:t>Turno N3: Lunes a jueves 18:00 – 00:30, viernes 18:00 – 00:30. Sábado y domingo libres.</w:t>
+      </w:r>
+    </w:p>
+    <w:p>
+      <w:pPr>
+        <w:ind w:left="360"/>
+        <w:jc w:val="both"/>
+      </w:pPr>
+      <w:r>
+        <w:rPr>
+          <w:b/>
+        </w:rPr>
+        <w:t>JORNADA DE 9 HORAS APROXIMADAS</w:t>
+      </w:r>
+    </w:p>
+    <w:p>
+      <w:pPr>
+        <w:ind w:left="360"/>
+        <w:jc w:val="both"/>
+      </w:pPr>
+      <w:r>
+        <w:rPr>
+          <w:b/>
+        </w:rPr>
+        <w:t>TURNOS AM</w:t>
+      </w:r>
+    </w:p>
+    <w:p>
+      <w:pPr>
+        <w:ind w:left="360"/>
+        <w:jc w:val="both"/>
+      </w:pPr>
+      <w:r>
+        <w:rPr>
+          <w:b w:val="0"/>
+        </w:rPr>
+        <w:t>Turno D1: Lunes a miércoles 09:00 – 19:00, jueves 09:00 – 18:00, viernes 09:00 – 13:00. Sábado y domingo libres.</w:t>
+      </w:r>
+    </w:p>
+    <w:p>
+      <w:pPr>
+        <w:ind w:left="360"/>
+        <w:jc w:val="both"/>
+      </w:pPr>
+      <w:r>
+        <w:rPr>
+          <w:b w:val="0"/>
+        </w:rPr>
+        <w:t>Turno D2: Lunes a miércoles 09:30 – 19:30, jueves 09:30 – 18:30, viernes 09:30 – 13:30. Sábado y domingo libres.</w:t>
+      </w:r>
+    </w:p>
+    <w:p>
+      <w:pPr>
+        <w:ind w:left="360"/>
+        <w:jc w:val="both"/>
+      </w:pPr>
+      <w:r>
+        <w:rPr>
+          <w:b w:val="0"/>
+        </w:rPr>
+        <w:t>Turno D3: Lunes a miércoles 10:00 – 20:00, jueves 10:00 – 19:00, viernes 10:00 – 14:00. Sábado y domingo libres.</w:t>
+      </w:r>
+    </w:p>
+    <w:p>
+      <w:pPr>
+        <w:ind w:left="360"/>
+        <w:jc w:val="both"/>
+      </w:pPr>
+      <w:r>
+        <w:rPr>
+          <w:b w:val="0"/>
+        </w:rPr>
+        <w:t>Turno D4: Lunes a miércoles 10:30 – 20:30, jueves 10:30 – 19:30, viernes 10:30 – 14:30. Sábado y domingo libres.</w:t>
+      </w:r>
+    </w:p>
+    <w:p>
+      <w:pPr>
+        <w:ind w:left="360"/>
+        <w:jc w:val="both"/>
+      </w:pPr>
+      <w:r>
+        <w:rPr>
+          <w:b w:val="0"/>
+        </w:rPr>
+        <w:t>Turno D5: Lunes a miércoles 11:00 – 21:00, jueves 11:00 – 20:00, viernes 11:00 – 15:00. Sábado y domingo libres.</w:t>
+      </w:r>
+    </w:p>
+    <w:p>
+      <w:pPr>
+        <w:ind w:left="360"/>
+        <w:jc w:val="both"/>
+      </w:pPr>
+      <w:r>
+        <w:rPr>
+          <w:b w:val="0"/>
+        </w:rPr>
+        <w:t>Turno D6: Lunes a miércoles 11:30 – 20:30, jueves 11:30 – 19:30, viernes 11:30 – 15:30. Sábado y domingo libres.</w:t>
+      </w:r>
+    </w:p>
+    <w:p>
+      <w:pPr>
+        <w:ind w:left="360"/>
+        <w:jc w:val="both"/>
+      </w:pPr>
+      <w:r>
+        <w:rPr>
+          <w:b w:val="0"/>
+        </w:rPr>
+        <w:t>Turno D7: Lunes a miércoles 12:00 – 21:00, jueves 12:00 – 20:00, viernes 12:00 – 16:00. Sábado y domingo libres.</w:t>
+      </w:r>
+    </w:p>
+    <w:p>
+      <w:pPr>
+        <w:ind w:left="360"/>
+        <w:jc w:val="both"/>
+      </w:pPr>
+      <w:r>
+        <w:rPr>
+          <w:b/>
+        </w:rPr>
+        <w:t>TURNOS PM</w:t>
+      </w:r>
+    </w:p>
+    <w:p>
+      <w:pPr>
+        <w:ind w:left="360"/>
+        <w:jc w:val="both"/>
+      </w:pPr>
+      <w:r>
+        <w:rPr>
+          <w:b w:val="0"/>
+        </w:rPr>
+        <w:t>Turno P1: Lunes a miércoles 15:00 – 00:00, jueves 15:00 – 22:00, viernes 15:00 – 19:00. Sábado y domingo libres.</w:t>
+      </w:r>
+    </w:p>
+    <w:p>
+      <w:pPr>
+        <w:ind w:left="360"/>
+        <w:jc w:val="both"/>
+      </w:pPr>
+      <w:r>
+        <w:rPr>
+          <w:b w:val="0"/>
+        </w:rPr>
+        <w:t>Turno P2: Lunes a miércoles 15:30 – 00:30, jueves 15:30 – 22:30, viernes 15:30 – 19:30. Sábado y domingo libres.</w:t>
+      </w:r>
+    </w:p>
+    <w:p>
+      <w:pPr>
+        <w:ind w:left="360"/>
+        <w:jc w:val="both"/>
+      </w:pPr>
+      <w:r>
+        <w:rPr>
+          <w:b w:val="0"/>
+        </w:rPr>
+        <w:t>Turno P3: Lunes a miércoles 16:00 – 00:30, jueves 16:00 – 23:00, viernes 16:00 – 20:00. Sábado y domingo libres.</w:t>
+      </w:r>
+    </w:p>
+    <w:p>
+      <w:pPr>
+        <w:ind w:left="360"/>
+        <w:jc w:val="both"/>
+      </w:pPr>
+      <w:r>
+        <w:rPr>
+          <w:b w:val="0"/>
+        </w:rPr>
+        <w:t>Turno P4: Lunes a miércoles 16:30 – 00:30, jueves 16:30 – 23:30, viernes 16:30 – 20:30. Sábado y domingo libres.</w:t>
+      </w:r>
+    </w:p>
+    <w:p>
+      <w:pPr>
+        <w:ind w:left="360"/>
+        <w:jc w:val="both"/>
+      </w:pPr>
+      <w:r>
+        <w:rPr>
+          <w:b/>
+        </w:rPr>
+        <w:t>JORNADA DE 9,5 HORAS APROXIMADAS</w:t>
+      </w:r>
+    </w:p>
+    <w:p>
+      <w:pPr>
+        <w:ind w:left="360"/>
+        <w:jc w:val="both"/>
+      </w:pPr>
+      <w:r>
+        <w:rPr>
+          <w:b/>
+        </w:rPr>
+        <w:t>TURNOS AM</w:t>
+      </w:r>
+    </w:p>
+    <w:p>
+      <w:pPr>
+        <w:ind w:left="360"/>
+        <w:jc w:val="both"/>
+      </w:pPr>
+      <w:r>
+        <w:rPr>
+          <w:b w:val="0"/>
+        </w:rPr>
+        <w:t>Turno E1: Lunes a miércoles 09:00 – 19:00, jueves 09:00 – 18:00, viernes 09:00 – 13:00. Sábado y domingo libres.</w:t>
+      </w:r>
+    </w:p>
+    <w:p>
+      <w:pPr>
+        <w:ind w:left="360"/>
+        <w:jc w:val="both"/>
+      </w:pPr>
+      <w:r>
+        <w:rPr>
+          <w:b w:val="0"/>
+        </w:rPr>
+        <w:t>Turno E2: Lunes a miércoles 09:30 – 19:30, jueves 09:30 – 18:30, viernes 09:30 – 13:30. Sábado y domingo libres.</w:t>
+      </w:r>
+    </w:p>
+    <w:p>
+      <w:pPr>
+        <w:ind w:left="360"/>
+        <w:jc w:val="both"/>
+      </w:pPr>
+      <w:r>
+        <w:rPr>
+          <w:b w:val="0"/>
+        </w:rPr>
+        <w:t>Turno E3: Lunes a miércoles 10:00 – 20:00, jueves 10:00 – 19:00, viernes 10:00 – 14:00. Sábado y domingo libres.</w:t>
+      </w:r>
+    </w:p>
+    <w:p>
+      <w:pPr>
+        <w:ind w:left="360"/>
+        <w:jc w:val="both"/>
+      </w:pPr>
+      <w:r>
+        <w:rPr>
+          <w:b w:val="0"/>
+        </w:rPr>
+        <w:t>Turno E4: Lunes a miércoles 10:30 – 20:30, jueves 10:30 – 19:30, viernes 10:30 – 14:30. Sábado y domingo libres.</w:t>
+      </w:r>
+    </w:p>
+    <w:p>
+      <w:pPr>
+        <w:ind w:left="360"/>
+        <w:jc w:val="both"/>
+      </w:pPr>
+      <w:r>
+        <w:rPr>
+          <w:b w:val="0"/>
+        </w:rPr>
+        <w:t>Turno E5: Lunes a miércoles 11:00 – 21:00, jueves 11:00 – 20:00, viernes 11:00 – 15:00. Sábado y domingo libres.</w:t>
+      </w:r>
+    </w:p>
+    <w:p>
+      <w:pPr>
+        <w:ind w:left="360"/>
+        <w:jc w:val="both"/>
+      </w:pPr>
+      <w:r>
+        <w:rPr>
+          <w:b w:val="0"/>
+        </w:rPr>
+        <w:t>Turno E6: Lunes a miércoles 12:00 – 22:00, jueves 12:00 – 20:30, viernes 12:00 – 14:00. Sábado y domingo libres.</w:t>
+      </w:r>
+    </w:p>
+    <w:p>
+      <w:pPr>
+        <w:ind w:left="360"/>
+        <w:jc w:val="both"/>
+      </w:pPr>
+      <w:r>
+        <w:rPr>
+          <w:b/>
+        </w:rPr>
+        <w:t>TURNOS PM</w:t>
+      </w:r>
+    </w:p>
+    <w:p>
+      <w:pPr>
+        <w:ind w:left="360"/>
+        <w:jc w:val="both"/>
+      </w:pPr>
+      <w:r>
+        <w:rPr>
+          <w:b w:val="0"/>
+        </w:rPr>
+        <w:t>Turno P1: Lunes a miércoles 13:00 – 23:00, jueves 13:00 – 22:00, viernes 13:00 – 17:00. Sábado y domingo libres.</w:t>
+      </w:r>
+    </w:p>
+    <w:p>
+      <w:pPr>
+        <w:ind w:left="360"/>
+        <w:jc w:val="both"/>
+      </w:pPr>
+      <w:r>
+        <w:rPr>
+          <w:b w:val="0"/>
+        </w:rPr>
+        <w:t>Turno P2: Lunes a miércoles 13:30 – 23:30, jueves 13:30 – 22:30, viernes 13:30 – 17:30. Sábado y domingo libres.</w:t>
+      </w:r>
+    </w:p>
+    <w:p>
+      <w:pPr>
+        <w:ind w:left="360"/>
+        <w:jc w:val="both"/>
+      </w:pPr>
+      <w:r>
+        <w:rPr>
+          <w:b w:val="0"/>
+        </w:rPr>
+        <w:t>Turno P3: Lunes a miércoles 14:00 – 00:00, jueves 14:00 – 23:00, viernes 14:00 – 18:00. Sábado y domingo libres.</w:t>
+      </w:r>
+    </w:p>
+    <w:p>
+      <w:pPr>
+        <w:ind w:left="360"/>
+        <w:jc w:val="both"/>
+      </w:pPr>
+      <w:r>
+        <w:rPr>
+          <w:b w:val="0"/>
+        </w:rPr>
+        <w:t>Turno P4: Lunes a miércoles 14:30 – 00:30, jueves 14:30 – 23:30, viernes 14:30 – 18:30. Sábado y domingo libres.</w:t>
+      </w:r>
+    </w:p>
+    <w:p>
+      <w:pPr>
+        <w:ind w:left="360"/>
+        <w:jc w:val="both"/>
+      </w:pPr>
+      <w:r>
+        <w:rPr>
+          <w:b/>
+        </w:rPr>
+        <w:t>JORNADA DE 10 HORAS APROXIMADAS</w:t>
+      </w:r>
+    </w:p>
+    <w:p>
+      <w:pPr>
+        <w:ind w:left="360"/>
+        <w:jc w:val="both"/>
+      </w:pPr>
+      <w:r>
+        <w:rPr>
+          <w:b/>
+        </w:rPr>
+        <w:t>TURNOS AM</w:t>
+      </w:r>
+    </w:p>
+    <w:p>
+      <w:pPr>
+        <w:ind w:left="360"/>
+        <w:jc w:val="both"/>
+      </w:pPr>
+      <w:r>
+        <w:rPr>
+          <w:b w:val="0"/>
+        </w:rPr>
+        <w:t>Turno F1: Lunes a miércoles 09:00 – 19:00, jueves 09:00 – 18:00, viernes 09:00 – 13:00. Sábado y domingo libres.</w:t>
+      </w:r>
+    </w:p>
+    <w:p>
+      <w:pPr>
+        <w:ind w:left="360"/>
+        <w:jc w:val="both"/>
+      </w:pPr>
+      <w:r>
+        <w:rPr>
+          <w:b w:val="0"/>
+        </w:rPr>
+        <w:t>Turno F2: Lunes a miércoles 09:30 – 19:30, jueves 09:30 – 18:30, viernes 09:30 – 13:30. Sábado y domingo libres.</w:t>
+      </w:r>
+    </w:p>
+    <w:p>
+      <w:pPr>
+        <w:ind w:left="360"/>
+        <w:jc w:val="both"/>
+      </w:pPr>
+      <w:r>
+        <w:rPr>
+          <w:b w:val="0"/>
+        </w:rPr>
+        <w:t>Turno F3: Lunes a miércoles 10:00 – 20:00, jueves 10:00 – 19:00, viernes 10:00 – 14:00. Sábado y domingo libres.</w:t>
+      </w:r>
+    </w:p>
+    <w:p>
+      <w:pPr>
+        <w:ind w:left="360"/>
+        <w:jc w:val="both"/>
+      </w:pPr>
+      <w:r>
+        <w:rPr>
+          <w:b w:val="0"/>
+        </w:rPr>
+        <w:t>Turno F4: Lunes a miércoles 10:30 – 20:30, jueves 10:30 – 19:30, viernes 10:30 – 14:30. Sábado y domingo libres.</w:t>
+      </w:r>
+    </w:p>
+    <w:p>
+      <w:pPr>
+        <w:ind w:left="360"/>
+        <w:jc w:val="both"/>
+      </w:pPr>
+      <w:r>
+        <w:rPr>
+          <w:b w:val="0"/>
+        </w:rPr>
+        <w:t>Turno F5: Lunes a miércoles 11:00 – 21:00, jueves 11:00 – 20:00, viernes 11:00 – 15:00. Sábado y domingo libres.</w:t>
+      </w:r>
+    </w:p>
+    <w:p>
+      <w:pPr>
+        <w:ind w:left="360"/>
+        <w:jc w:val="both"/>
+      </w:pPr>
+      <w:r>
+        <w:rPr>
+          <w:b/>
+        </w:rPr>
+        <w:t>TURNOS PM</w:t>
+      </w:r>
+    </w:p>
+    <w:p>
+      <w:pPr>
+        <w:ind w:left="360"/>
+        <w:jc w:val="both"/>
+      </w:pPr>
+      <w:r>
+        <w:rPr>
+          <w:b w:val="0"/>
+        </w:rPr>
+        <w:t>Turno P1: Lunes a miércoles 13:00 – 23:00, jueves 13:00 – 22:00, viernes 13:00 – 17:00. Sábado y domingo libres.</w:t>
+      </w:r>
+    </w:p>
+    <w:p>
+      <w:pPr>
+        <w:ind w:left="360"/>
+        <w:jc w:val="both"/>
+      </w:pPr>
+      <w:r>
+        <w:rPr>
+          <w:b w:val="0"/>
+        </w:rPr>
+        <w:t>Turno P2: Lunes a miércoles 13:30 – 23:30, jueves 13:30 – 22:30, viernes 13:30 – 17:30. Sábado y domingo libres.</w:t>
+      </w:r>
+    </w:p>
+    <w:p>
+      <w:pPr>
+        <w:ind w:left="360"/>
+        <w:jc w:val="both"/>
+      </w:pPr>
+      <w:r>
+        <w:rPr>
+          <w:b w:val="0"/>
+        </w:rPr>
+        <w:t>Turno P3: Lunes a miércoles 14:00 – 00:00, jueves 14:00 – 23:00, viernes 14:00 – 18:00. Sábado y domingo libres.</w:t>
+      </w:r>
+    </w:p>
+    <w:p>
+      <w:pPr>
+        <w:ind w:left="360"/>
+        <w:jc w:val="both"/>
+      </w:pPr>
+      <w:r>
+        <w:rPr>
+          <w:b w:val="0"/>
+        </w:rPr>
+        <w:t>Turno P4: Lunes a miércoles 14:30 – 00:30, jueves 14:30 – 23:30, viernes 14:30 – 18:30. Sábado y domingo libres.</w:t>
+      </w:r>
+    </w:p>
+    <w:p>
+      <w:pPr>
+        <w:ind w:left="360"/>
+        <w:jc w:val="both"/>
+      </w:pPr>
+      <w:r>
+        <w:rPr>
+          <w:b w:val="0"/>
+        </w:rPr>
+        <w:t>Turno P5: Lunes a miércoles 13:00 – 21:00, jueves 13:00 – 20:30, viernes 13:00 – 17:00. Sábado y domingo libres.</w:t>
+      </w:r>
+    </w:p>
+    <w:p>
+      <w:pPr>
+        <w:ind w:left="360"/>
+        <w:jc w:val="both"/>
+      </w:pPr>
+      <w:r>
+        <w:rPr>
+          <w:b w:val="0"/>
+        </w:rPr>
+        <w:t>Turno P6: Lunes a miércoles 13:30 – 22:00, jueves 13:30 – 21:30, viernes 13:30 – 17:30. Sábado y domingo libres.</w:t>
+      </w:r>
+    </w:p>
+    <w:p>
+      <w:pPr>
+        <w:ind w:left="360"/>
+        <w:jc w:val="both"/>
+      </w:pPr>
+      <w:r>
+        <w:rPr>
+          <w:b w:val="0"/>
+        </w:rPr>
+        <w:t>Turno P7: Lunes a miércoles 14:00 – 22:30, jueves 14:00 – 21:30, viernes 14:00 – 18:00. Sábado y domingo libres.</w:t>
+      </w:r>
+    </w:p>
+    <w:p>
+      <w:pPr>
+        <w:ind w:left="360"/>
+        <w:jc w:val="both"/>
+      </w:pPr>
+      <w:r>
+        <w:rPr>
+          <w:b w:val="0"/>
+        </w:rPr>
+        <w:t>Turno N1: Lunes a miércoles 16:00 – 00:30, jueves 16:00 – 23:30, viernes 16:00 – 20:00. Sábado y domingo libres.</w:t>
+      </w:r>
+    </w:p>
+    <w:p>
+      <w:pPr>
+        <w:ind w:left="360"/>
+        <w:jc w:val="both"/>
+      </w:pPr>
+      <w:r>
+        <w:rPr>
+          <w:b w:val="0"/>
+        </w:rPr>
+        <w:t>Turno N2: Lunes a miércoles 16:30 – 00:30, jueves 16:30 – 23:30, viernes 16:30 – 20:30. Sábado y domingo libres.</w:t>
+      </w:r>
+    </w:p>
+    <w:p>
+      <w:pPr>
+        <w:ind w:left="360"/>
+        <w:jc w:val="both"/>
+      </w:pPr>
+      <w:r>
+        <w:rPr>
+          <w:b w:val="0"/>
+        </w:rPr>
+        <w:t>Turno N3: Lunes a miércoles 17:00 – 00:30, jueves 17:00 – 23:30, viernes 17:00 – 21:00. Sábado y domingo libres.</w:t>
+      </w:r>
+    </w:p>
+    <w:p>
+      <w:pPr>
+        <w:jc w:val="both"/>
+      </w:pPr>
+      <w:r>
+        <w:t>Las jornadas y turnos señalados en el presente contrato tendrán carácter referencial. Además, deben ser pactados expresamente y comunicados al trabajador con una anticipación mínima de una semana, y podrán ajustarse según las necesidades operativas de la empresa, respetando siempre los límites legales de jornada y descanso establecidos en la legislación vigente. En todo caso, dichas modificaciones no podrán implicar menoscabo para el trabajador ni exceder los límites legales aplicables. Se deja establecido que los horarios de los turnos se encuentran en el Reglamento Interno de la empresa.</w:t>
       </w:r>
     </w:p>
     <w:p/>
@@ -172,6 +1587,9 @@
         <w:jc w:val="both"/>
       </w:pPr>
       <w:r>
+        <w:rPr>
+          <w:b w:val="0"/>
+        </w:rPr>
         <w:t>1) Sueldo Base: $ {SUELDO_BASE} ({SUELDO_BASE_PALABRA})</w:t>
       </w:r>
     </w:p>
@@ -181,6 +1599,9 @@
         <w:jc w:val="both"/>
       </w:pPr>
       <w:r>
+        <w:rPr>
+          <w:b w:val="0"/>
+        </w:rPr>
         <w:t>2) Asignación de movilización: $ {ASIGNACION_MOVILIZACION} ({ASIGNACION_MOVILIZACION_PALABRA})</w:t>
       </w:r>
     </w:p>
@@ -190,6 +1611,9 @@
         <w:jc w:val="both"/>
       </w:pPr>
       <w:r>
+        <w:rPr>
+          <w:b w:val="0"/>
+        </w:rPr>
         <w:t>3) Asignación de colación: $ {ASIGNACION_COLACION} ({ASIGNACION_COLACION_PALABRA})</w:t>
       </w:r>
     </w:p>
@@ -245,6 +1669,9 @@
         <w:jc w:val="both"/>
       </w:pPr>
       <w:r>
+        <w:rPr>
+          <w:b w:val="0"/>
+        </w:rPr>
         <w:t>1. Normas Sanitarias: es causal de término inmediato el incumplimiento de normas de higiene que ponga en riesgo la salud de los clientes (ej.: contaminación cruzada, falta de aseo personal).</w:t>
       </w:r>
     </w:p>
@@ -254,6 +1681,9 @@
         <w:jc w:val="both"/>
       </w:pPr>
       <w:r>
+        <w:rPr>
+          <w:b w:val="0"/>
+        </w:rPr>
         <w:t>2. Mermas y Consumo: queda prohibido el consumo de insumos o productos terminados sin autorización y el desperdicio injustificado de materias primas.</w:t>
       </w:r>
     </w:p>
@@ -263,6 +1693,9 @@
         <w:jc w:val="both"/>
       </w:pPr>
       <w:r>
+        <w:rPr>
+          <w:b w:val="0"/>
+        </w:rPr>
         <w:t>3. Seguridad: es obligatorio el uso de EPP (cofia, zapatos antideslizantes, guantes) en todo momento dentro del área de producción.</w:t>
       </w:r>
     </w:p>

</xml_diff>